<commit_message>
feat: Initialize Anclora-Age project
</commit_message>
<xml_diff>
--- a/triumph-renta-mallorca-SEO/Entregables/AI_Consultancy_Proposal_EN.docx
+++ b/triumph-renta-mallorca-SEO/Entregables/AI_Consultancy_Proposal_EN.docx
@@ -606,7 +606,7 @@
           <w:b/>
           <w:bCs/>
         </w:rPr>
-        <w:t xml:space="preserve">Antonio Ballesteros</w:t>
+        <w:t xml:space="preserve">ANTONIO BALLESTEROS</w:t>
       </w:r>
       <w:r/>
     </w:p>
@@ -765,7 +765,7 @@
     <w:tr>
       <w:tc>
         <w:tcPr>
-          <w:tcW w:type="pct" w:w="60%"/>
+          <w:tcW w:type="pct" w:w="50%"/>
           <w:vAlign w:val="center"/>
         </w:tcPr>
         <w:p>
@@ -773,8 +773,8 @@
             <w:rPr>
               <w:b/>
               <w:bCs/>
-              <w:sz w:val="22"/>
-              <w:szCs w:val="22"/>
+              <w:sz w:val="20"/>
+              <w:szCs w:val="20"/>
             </w:rPr>
             <w:t xml:space="preserve">AI Consultancy Proposal</w:t>
           </w:r>
@@ -783,16 +783,16 @@
               <w:i/>
               <w:iCs/>
               <w:color w:val="666666"/>
-              <w:sz w:val="18"/>
-              <w:szCs w:val="18"/>
+              <w:sz w:val="16"/>
+              <w:szCs w:val="16"/>
             </w:rPr>
-            <w:t xml:space="preserve"> | v2.5</w:t>
+            <w:t xml:space="preserve"> | v3.0</w:t>
           </w:r>
         </w:p>
       </w:tc>
       <w:tc>
         <w:tcPr>
-          <w:tcW w:type="pct" w:w="40%"/>
+          <w:tcW w:type="pct" w:w="50%"/>
           <w:vAlign w:val="center"/>
         </w:tcPr>
         <w:p>
@@ -802,7 +802,7 @@
           <w:r>
             <w:drawing>
               <wp:inline distT="0" distB="0" distL="0" distR="0">
-                <wp:extent cx="428625" cy="428625"/>
+                <wp:extent cx="381000" cy="381000"/>
                 <wp:effectExtent t="0" r="0" b="0" l="0"/>
                 <wp:docPr id="1" name="" descr="" title=""/>
                 <wp:cNvGraphicFramePr>
@@ -827,7 +827,7 @@
                       <pic:spPr bwMode="auto">
                         <a:xfrm>
                           <a:off x="0" y="0"/>
-                          <a:ext cx="428625" cy="428625"/>
+                          <a:ext cx="381000" cy="381000"/>
                         </a:xfrm>
                         <a:prstGeom prst="rect">
                           <a:avLst/>
@@ -843,11 +843,10 @@
             <w:rPr>
               <w:b/>
               <w:bCs/>
-              <w:sz w:val="20"/>
-              <w:szCs w:val="20"/>
-              <w:rFonts w:ascii="Arial" w:cs="Arial" w:eastAsia="Arial" w:hAnsi="Arial"/>
+              <w:sz w:val="18"/>
+              <w:szCs w:val="18"/>
             </w:rPr>
-            <w:t xml:space="preserve"> Antonio Ballesteros</w:t>
+            <w:t xml:space="preserve"> ANTONIO BALLESTEROS</w:t>
           </w:r>
         </w:p>
         <w:p>
@@ -859,10 +858,10 @@
               <w:i/>
               <w:iCs/>
               <w:color w:val="777777"/>
-              <w:sz w:val="14"/>
-              <w:szCs w:val="14"/>
+              <w:sz w:val="12"/>
+              <w:szCs w:val="12"/>
             </w:rPr>
-            <w:t xml:space="preserve">Estratega de IA y Soluciones Cognitivas</w:t>
+            <w:t xml:space="preserve">FOUNDER &amp; AI STRATEGIST</w:t>
           </w:r>
         </w:p>
       </w:tc>

</xml_diff>